<commit_message>
Started make a first page
</commit_message>
<xml_diff>
--- a/GestionDeProjet.docx
+++ b/GestionDeProjet.docx
@@ -47,6 +47,10 @@
     </w:p>
     <w:p>
       <w:r>
+        <w:rPr>
+          <w:noProof/>
+          <w:lang w:eastAsia="ru-RU"/>
+        </w:rPr>
         <w:drawing>
           <wp:inline distT="0" distB="0" distL="0" distR="0" wp14:anchorId="30D049FA" wp14:editId="1E2F2549">
             <wp:extent cx="5940425" cy="3027045"/>
@@ -72,6 +76,46 @@
                     <a:xfrm>
                       <a:off x="0" y="0"/>
                       <a:ext cx="5940425" cy="3027045"/>
+                    </a:xfrm>
+                    <a:prstGeom prst="rect">
+                      <a:avLst/>
+                    </a:prstGeom>
+                  </pic:spPr>
+                </pic:pic>
+              </a:graphicData>
+            </a:graphic>
+          </wp:inline>
+        </w:drawing>
+      </w:r>
+    </w:p>
+    <w:p>
+      <w:r>
+        <w:lastRenderedPageBreak/>
+        <w:drawing>
+          <wp:inline distT="0" distB="0" distL="0" distR="0" wp14:anchorId="31DABE60" wp14:editId="40C45A3E">
+            <wp:extent cx="5940425" cy="3042285"/>
+            <wp:effectExtent l="0" t="0" r="3175" b="5715"/>
+            <wp:docPr id="3" name="Рисунок 3"/>
+            <wp:cNvGraphicFramePr>
+              <a:graphicFrameLocks xmlns:a="http://schemas.openxmlformats.org/drawingml/2006/main" noChangeAspect="1"/>
+            </wp:cNvGraphicFramePr>
+            <a:graphic xmlns:a="http://schemas.openxmlformats.org/drawingml/2006/main">
+              <a:graphicData uri="http://schemas.openxmlformats.org/drawingml/2006/picture">
+                <pic:pic xmlns:pic="http://schemas.openxmlformats.org/drawingml/2006/picture">
+                  <pic:nvPicPr>
+                    <pic:cNvPr id="1" name=""/>
+                    <pic:cNvPicPr/>
+                  </pic:nvPicPr>
+                  <pic:blipFill>
+                    <a:blip r:embed="rId6"/>
+                    <a:stretch>
+                      <a:fillRect/>
+                    </a:stretch>
+                  </pic:blipFill>
+                  <pic:spPr>
+                    <a:xfrm>
+                      <a:off x="0" y="0"/>
+                      <a:ext cx="5940425" cy="3042285"/>
                     </a:xfrm>
                     <a:prstGeom prst="rect">
                       <a:avLst/>

</xml_diff>

<commit_message>
Added comments to the screenshots in the project
</commit_message>
<xml_diff>
--- a/GestionDeProjet.docx
+++ b/GestionDeProjet.docx
@@ -2,6 +2,84 @@
 <file path=word/document.xml><?xml version="1.0" encoding="utf-8"?>
 <w:document xmlns:wpc="http://schemas.microsoft.com/office/word/2010/wordprocessingCanvas" xmlns:cx="http://schemas.microsoft.com/office/drawing/2014/chartex" xmlns:mc="http://schemas.openxmlformats.org/markup-compatibility/2006" xmlns:o="urn:schemas-microsoft-com:office:office" xmlns:r="http://schemas.openxmlformats.org/officeDocument/2006/relationships" xmlns:m="http://schemas.openxmlformats.org/officeDocument/2006/math" xmlns:v="urn:schemas-microsoft-com:vml" xmlns:wp14="http://schemas.microsoft.com/office/word/2010/wordprocessingDrawing" xmlns:wp="http://schemas.openxmlformats.org/drawingml/2006/wordprocessingDrawing" xmlns:w10="urn:schemas-microsoft-com:office:word" xmlns:w="http://schemas.openxmlformats.org/wordprocessingml/2006/main" xmlns:w14="http://schemas.microsoft.com/office/word/2010/wordml" xmlns:w15="http://schemas.microsoft.com/office/word/2012/wordml" xmlns:w16se="http://schemas.microsoft.com/office/word/2015/wordml/symex" xmlns:wpg="http://schemas.microsoft.com/office/word/2010/wordprocessingGroup" xmlns:wpi="http://schemas.microsoft.com/office/word/2010/wordprocessingInk" xmlns:wne="http://schemas.microsoft.com/office/word/2006/wordml" xmlns:wps="http://schemas.microsoft.com/office/word/2010/wordprocessingShape" mc:Ignorable="w14 w15 w16se wp14">
   <w:body>
+    <w:p>
+      <w:pPr>
+        <w:pStyle w:val="a3"/>
+        <w:rPr>
+          <w:b/>
+          <w:sz w:val="28"/>
+          <w:szCs w:val="28"/>
+          <w:lang w:val="en-US"/>
+        </w:rPr>
+      </w:pPr>
+      <w:proofErr w:type="spellStart"/>
+      <w:r>
+        <w:rPr>
+          <w:b/>
+          <w:sz w:val="28"/>
+          <w:szCs w:val="28"/>
+          <w:lang w:val="en-US"/>
+        </w:rPr>
+        <w:t>J'ai</w:t>
+      </w:r>
+      <w:proofErr w:type="spellEnd"/>
+      <w:r>
+        <w:rPr>
+          <w:b/>
+          <w:sz w:val="28"/>
+          <w:szCs w:val="28"/>
+          <w:lang w:val="en-US"/>
+        </w:rPr>
+        <w:t xml:space="preserve"> </w:t>
+      </w:r>
+      <w:proofErr w:type="spellStart"/>
+      <w:r>
+        <w:rPr>
+          <w:b/>
+          <w:sz w:val="28"/>
+          <w:szCs w:val="28"/>
+          <w:lang w:val="en-US"/>
+        </w:rPr>
+        <w:t>créé</w:t>
+      </w:r>
+      <w:proofErr w:type="spellEnd"/>
+      <w:r>
+        <w:rPr>
+          <w:b/>
+          <w:sz w:val="28"/>
+          <w:szCs w:val="28"/>
+          <w:lang w:val="en-US"/>
+        </w:rPr>
+        <w:t xml:space="preserve"> un </w:t>
+      </w:r>
+      <w:proofErr w:type="spellStart"/>
+      <w:r>
+        <w:rPr>
+          <w:b/>
+          <w:sz w:val="28"/>
+          <w:szCs w:val="28"/>
+          <w:lang w:val="en-US"/>
+        </w:rPr>
+        <w:t>dépôt</w:t>
+      </w:r>
+      <w:proofErr w:type="spellEnd"/>
+      <w:r>
+        <w:rPr>
+          <w:b/>
+          <w:sz w:val="28"/>
+          <w:szCs w:val="28"/>
+          <w:lang w:val="en-US"/>
+        </w:rPr>
+        <w:t xml:space="preserve"> vide sur GitHub</w:t>
+      </w:r>
+    </w:p>
+    <w:p>
+      <w:pPr>
+        <w:rPr>
+          <w:lang w:val="en-US"/>
+        </w:rPr>
+      </w:pPr>
+    </w:p>
     <w:p>
       <w:r>
         <w:rPr>
@@ -13,89 +91,6 @@
             <wp:extent cx="5940425" cy="2952750"/>
             <wp:effectExtent l="0" t="0" r="3175" b="0"/>
             <wp:docPr id="1" name="Рисунок 1"/>
-            <wp:cNvGraphicFramePr>
-              <a:graphicFrameLocks xmlns:a="http://schemas.openxmlformats.org/drawingml/2006/main" noChangeAspect="1"/>
-            </wp:cNvGraphicFramePr>
-            <a:graphic xmlns:a="http://schemas.openxmlformats.org/drawingml/2006/main">
-              <a:graphicData uri="http://schemas.openxmlformats.org/drawingml/2006/picture">
-                <pic:pic xmlns:pic="http://schemas.openxmlformats.org/drawingml/2006/picture">
-                  <pic:nvPicPr>
-                    <pic:cNvPr id="1" name=""/>
-                    <pic:cNvPicPr/>
-                  </pic:nvPicPr>
-                  <pic:blipFill>
-                    <a:blip r:embed="rId4"/>
-                    <a:stretch>
-                      <a:fillRect/>
-                    </a:stretch>
-                  </pic:blipFill>
-                  <pic:spPr>
-                    <a:xfrm>
-                      <a:off x="0" y="0"/>
-                      <a:ext cx="5940425" cy="2952750"/>
-                    </a:xfrm>
-                    <a:prstGeom prst="rect">
-                      <a:avLst/>
-                    </a:prstGeom>
-                  </pic:spPr>
-                </pic:pic>
-              </a:graphicData>
-            </a:graphic>
-          </wp:inline>
-        </w:drawing>
-      </w:r>
-    </w:p>
-    <w:p>
-      <w:r>
-        <w:rPr>
-          <w:noProof/>
-          <w:lang w:eastAsia="ru-RU"/>
-        </w:rPr>
-        <w:drawing>
-          <wp:inline distT="0" distB="0" distL="0" distR="0" wp14:anchorId="30D049FA" wp14:editId="1E2F2549">
-            <wp:extent cx="5940425" cy="3027045"/>
-            <wp:effectExtent l="0" t="0" r="3175" b="1905"/>
-            <wp:docPr id="2" name="Рисунок 2"/>
-            <wp:cNvGraphicFramePr>
-              <a:graphicFrameLocks xmlns:a="http://schemas.openxmlformats.org/drawingml/2006/main" noChangeAspect="1"/>
-            </wp:cNvGraphicFramePr>
-            <a:graphic xmlns:a="http://schemas.openxmlformats.org/drawingml/2006/main">
-              <a:graphicData uri="http://schemas.openxmlformats.org/drawingml/2006/picture">
-                <pic:pic xmlns:pic="http://schemas.openxmlformats.org/drawingml/2006/picture">
-                  <pic:nvPicPr>
-                    <pic:cNvPr id="1" name=""/>
-                    <pic:cNvPicPr/>
-                  </pic:nvPicPr>
-                  <pic:blipFill>
-                    <a:blip r:embed="rId5"/>
-                    <a:stretch>
-                      <a:fillRect/>
-                    </a:stretch>
-                  </pic:blipFill>
-                  <pic:spPr>
-                    <a:xfrm>
-                      <a:off x="0" y="0"/>
-                      <a:ext cx="5940425" cy="3027045"/>
-                    </a:xfrm>
-                    <a:prstGeom prst="rect">
-                      <a:avLst/>
-                    </a:prstGeom>
-                  </pic:spPr>
-                </pic:pic>
-              </a:graphicData>
-            </a:graphic>
-          </wp:inline>
-        </w:drawing>
-      </w:r>
-    </w:p>
-    <w:p>
-      <w:r>
-        <w:lastRenderedPageBreak/>
-        <w:drawing>
-          <wp:inline distT="0" distB="0" distL="0" distR="0" wp14:anchorId="31DABE60" wp14:editId="40C45A3E">
-            <wp:extent cx="5940425" cy="3042285"/>
-            <wp:effectExtent l="0" t="0" r="3175" b="5715"/>
-            <wp:docPr id="3" name="Рисунок 3"/>
             <wp:cNvGraphicFramePr>
               <a:graphicFrameLocks xmlns:a="http://schemas.openxmlformats.org/drawingml/2006/main" noChangeAspect="1"/>
             </wp:cNvGraphicFramePr>
@@ -115,6 +110,486 @@
                   <pic:spPr>
                     <a:xfrm>
                       <a:off x="0" y="0"/>
+                      <a:ext cx="5940425" cy="2952750"/>
+                    </a:xfrm>
+                    <a:prstGeom prst="rect">
+                      <a:avLst/>
+                    </a:prstGeom>
+                  </pic:spPr>
+                </pic:pic>
+              </a:graphicData>
+            </a:graphic>
+          </wp:inline>
+        </w:drawing>
+      </w:r>
+    </w:p>
+    <w:p>
+      <w:pPr>
+        <w:pStyle w:val="a3"/>
+        <w:rPr>
+          <w:b/>
+          <w:sz w:val="28"/>
+          <w:szCs w:val="28"/>
+          <w:lang w:val="en-US"/>
+        </w:rPr>
+      </w:pPr>
+      <w:proofErr w:type="spellStart"/>
+      <w:r>
+        <w:rPr>
+          <w:b/>
+          <w:sz w:val="28"/>
+          <w:szCs w:val="28"/>
+          <w:lang w:val="en-US"/>
+        </w:rPr>
+        <w:t>J'y</w:t>
+      </w:r>
+      <w:proofErr w:type="spellEnd"/>
+      <w:r>
+        <w:rPr>
+          <w:b/>
+          <w:sz w:val="28"/>
+          <w:szCs w:val="28"/>
+          <w:lang w:val="en-US"/>
+        </w:rPr>
+        <w:t xml:space="preserve"> </w:t>
+      </w:r>
+      <w:proofErr w:type="spellStart"/>
+      <w:r>
+        <w:rPr>
+          <w:b/>
+          <w:sz w:val="28"/>
+          <w:szCs w:val="28"/>
+          <w:lang w:val="en-US"/>
+        </w:rPr>
+        <w:t>ai</w:t>
+      </w:r>
+      <w:proofErr w:type="spellEnd"/>
+      <w:r>
+        <w:rPr>
+          <w:b/>
+          <w:sz w:val="28"/>
+          <w:szCs w:val="28"/>
+          <w:lang w:val="en-US"/>
+        </w:rPr>
+        <w:t xml:space="preserve"> </w:t>
+      </w:r>
+      <w:proofErr w:type="spellStart"/>
+      <w:r>
+        <w:rPr>
+          <w:b/>
+          <w:sz w:val="28"/>
+          <w:szCs w:val="28"/>
+          <w:lang w:val="en-US"/>
+        </w:rPr>
+        <w:t>ajouté</w:t>
+      </w:r>
+      <w:proofErr w:type="spellEnd"/>
+      <w:r>
+        <w:rPr>
+          <w:b/>
+          <w:sz w:val="28"/>
+          <w:szCs w:val="28"/>
+          <w:lang w:val="en-US"/>
+        </w:rPr>
+        <w:t xml:space="preserve"> les </w:t>
+      </w:r>
+      <w:proofErr w:type="spellStart"/>
+      <w:r>
+        <w:rPr>
+          <w:b/>
+          <w:sz w:val="28"/>
+          <w:szCs w:val="28"/>
+          <w:lang w:val="en-US"/>
+        </w:rPr>
+        <w:t>membres</w:t>
+      </w:r>
+      <w:proofErr w:type="spellEnd"/>
+      <w:r>
+        <w:rPr>
+          <w:b/>
+          <w:sz w:val="28"/>
+          <w:szCs w:val="28"/>
+          <w:lang w:val="en-US"/>
+        </w:rPr>
+        <w:t xml:space="preserve"> de mon </w:t>
+      </w:r>
+      <w:proofErr w:type="spellStart"/>
+      <w:r>
+        <w:rPr>
+          <w:b/>
+          <w:sz w:val="28"/>
+          <w:szCs w:val="28"/>
+          <w:lang w:val="en-US"/>
+        </w:rPr>
+        <w:t>groupe</w:t>
+      </w:r>
+      <w:proofErr w:type="spellEnd"/>
+    </w:p>
+    <w:p>
+      <w:pPr>
+        <w:rPr>
+          <w:lang w:val="en-US"/>
+        </w:rPr>
+      </w:pPr>
+    </w:p>
+    <w:p>
+      <w:r>
+        <w:rPr>
+          <w:noProof/>
+          <w:lang w:eastAsia="ru-RU"/>
+        </w:rPr>
+        <w:drawing>
+          <wp:inline distT="0" distB="0" distL="0" distR="0" wp14:anchorId="30D049FA" wp14:editId="1E2F2549">
+            <wp:extent cx="5940425" cy="3027045"/>
+            <wp:effectExtent l="0" t="0" r="3175" b="1905"/>
+            <wp:docPr id="2" name="Рисунок 2"/>
+            <wp:cNvGraphicFramePr>
+              <a:graphicFrameLocks xmlns:a="http://schemas.openxmlformats.org/drawingml/2006/main" noChangeAspect="1"/>
+            </wp:cNvGraphicFramePr>
+            <a:graphic xmlns:a="http://schemas.openxmlformats.org/drawingml/2006/main">
+              <a:graphicData uri="http://schemas.openxmlformats.org/drawingml/2006/picture">
+                <pic:pic xmlns:pic="http://schemas.openxmlformats.org/drawingml/2006/picture">
+                  <pic:nvPicPr>
+                    <pic:cNvPr id="1" name=""/>
+                    <pic:cNvPicPr/>
+                  </pic:nvPicPr>
+                  <pic:blipFill>
+                    <a:blip r:embed="rId7"/>
+                    <a:stretch>
+                      <a:fillRect/>
+                    </a:stretch>
+                  </pic:blipFill>
+                  <pic:spPr>
+                    <a:xfrm>
+                      <a:off x="0" y="0"/>
+                      <a:ext cx="5940425" cy="3027045"/>
+                    </a:xfrm>
+                    <a:prstGeom prst="rect">
+                      <a:avLst/>
+                    </a:prstGeom>
+                  </pic:spPr>
+                </pic:pic>
+              </a:graphicData>
+            </a:graphic>
+          </wp:inline>
+        </w:drawing>
+      </w:r>
+    </w:p>
+    <w:p/>
+    <w:p/>
+    <w:p/>
+    <w:p/>
+    <w:p/>
+    <w:p/>
+    <w:p>
+      <w:pPr>
+        <w:pStyle w:val="a3"/>
+        <w:rPr>
+          <w:b/>
+          <w:sz w:val="28"/>
+          <w:szCs w:val="28"/>
+          <w:lang w:val="en-US"/>
+        </w:rPr>
+      </w:pPr>
+      <w:r>
+        <w:rPr>
+          <w:b/>
+          <w:sz w:val="28"/>
+          <w:szCs w:val="28"/>
+          <w:lang w:val="en-US"/>
+        </w:rPr>
+        <w:lastRenderedPageBreak/>
+        <w:t xml:space="preserve">À </w:t>
+      </w:r>
+      <w:proofErr w:type="spellStart"/>
+      <w:r>
+        <w:rPr>
+          <w:b/>
+          <w:sz w:val="28"/>
+          <w:szCs w:val="28"/>
+          <w:lang w:val="en-US"/>
+        </w:rPr>
+        <w:t>l'aide</w:t>
+      </w:r>
+      <w:proofErr w:type="spellEnd"/>
+      <w:r>
+        <w:rPr>
+          <w:b/>
+          <w:sz w:val="28"/>
+          <w:szCs w:val="28"/>
+          <w:lang w:val="en-US"/>
+        </w:rPr>
+        <w:t xml:space="preserve"> du terminal, </w:t>
+      </w:r>
+      <w:proofErr w:type="spellStart"/>
+      <w:r>
+        <w:rPr>
+          <w:b/>
+          <w:sz w:val="28"/>
+          <w:szCs w:val="28"/>
+          <w:lang w:val="en-US"/>
+        </w:rPr>
+        <w:t>j'ai</w:t>
+      </w:r>
+      <w:proofErr w:type="spellEnd"/>
+      <w:r>
+        <w:rPr>
+          <w:b/>
+          <w:sz w:val="28"/>
+          <w:szCs w:val="28"/>
+          <w:lang w:val="en-US"/>
+        </w:rPr>
+        <w:t xml:space="preserve"> </w:t>
+      </w:r>
+      <w:proofErr w:type="spellStart"/>
+      <w:r>
+        <w:rPr>
+          <w:b/>
+          <w:sz w:val="28"/>
+          <w:szCs w:val="28"/>
+          <w:lang w:val="en-US"/>
+        </w:rPr>
+        <w:t>connecté</w:t>
+      </w:r>
+      <w:proofErr w:type="spellEnd"/>
+      <w:r>
+        <w:rPr>
+          <w:b/>
+          <w:sz w:val="28"/>
+          <w:szCs w:val="28"/>
+          <w:lang w:val="en-US"/>
+        </w:rPr>
+        <w:t xml:space="preserve"> le </w:t>
+      </w:r>
+      <w:proofErr w:type="spellStart"/>
+      <w:r>
+        <w:rPr>
+          <w:b/>
+          <w:sz w:val="28"/>
+          <w:szCs w:val="28"/>
+          <w:lang w:val="en-US"/>
+        </w:rPr>
+        <w:t>projet</w:t>
+      </w:r>
+      <w:proofErr w:type="spellEnd"/>
+      <w:r>
+        <w:rPr>
+          <w:b/>
+          <w:sz w:val="28"/>
+          <w:szCs w:val="28"/>
+          <w:lang w:val="en-US"/>
+        </w:rPr>
+        <w:t xml:space="preserve"> local au </w:t>
+      </w:r>
+      <w:proofErr w:type="spellStart"/>
+      <w:r>
+        <w:rPr>
+          <w:b/>
+          <w:sz w:val="28"/>
+          <w:szCs w:val="28"/>
+          <w:lang w:val="en-US"/>
+        </w:rPr>
+        <w:t>dépôt</w:t>
+      </w:r>
+      <w:proofErr w:type="spellEnd"/>
+      <w:r>
+        <w:rPr>
+          <w:b/>
+          <w:sz w:val="28"/>
+          <w:szCs w:val="28"/>
+          <w:lang w:val="en-US"/>
+        </w:rPr>
+        <w:t xml:space="preserve"> distant et je </w:t>
+      </w:r>
+      <w:proofErr w:type="spellStart"/>
+      <w:r>
+        <w:rPr>
+          <w:b/>
+          <w:sz w:val="28"/>
+          <w:szCs w:val="28"/>
+          <w:lang w:val="en-US"/>
+        </w:rPr>
+        <w:t>l'y</w:t>
+      </w:r>
+      <w:proofErr w:type="spellEnd"/>
+      <w:r>
+        <w:rPr>
+          <w:b/>
+          <w:sz w:val="28"/>
+          <w:szCs w:val="28"/>
+          <w:lang w:val="en-US"/>
+        </w:rPr>
+        <w:t xml:space="preserve"> </w:t>
+      </w:r>
+      <w:proofErr w:type="spellStart"/>
+      <w:r>
+        <w:rPr>
+          <w:b/>
+          <w:sz w:val="28"/>
+          <w:szCs w:val="28"/>
+          <w:lang w:val="en-US"/>
+        </w:rPr>
+        <w:t>ai</w:t>
+      </w:r>
+      <w:proofErr w:type="spellEnd"/>
+      <w:r>
+        <w:rPr>
+          <w:b/>
+          <w:sz w:val="28"/>
+          <w:szCs w:val="28"/>
+          <w:lang w:val="en-US"/>
+        </w:rPr>
+        <w:t xml:space="preserve"> </w:t>
+      </w:r>
+      <w:proofErr w:type="spellStart"/>
+      <w:r>
+        <w:rPr>
+          <w:b/>
+          <w:sz w:val="28"/>
+          <w:szCs w:val="28"/>
+          <w:lang w:val="en-US"/>
+        </w:rPr>
+        <w:t>envoyé</w:t>
+      </w:r>
+      <w:proofErr w:type="spellEnd"/>
+      <w:r>
+        <w:rPr>
+          <w:b/>
+          <w:sz w:val="28"/>
+          <w:szCs w:val="28"/>
+          <w:lang w:val="en-US"/>
+        </w:rPr>
+        <w:t xml:space="preserve"> </w:t>
+      </w:r>
+      <w:proofErr w:type="spellStart"/>
+      <w:r>
+        <w:rPr>
+          <w:b/>
+          <w:sz w:val="28"/>
+          <w:szCs w:val="28"/>
+          <w:lang w:val="en-US"/>
+        </w:rPr>
+        <w:t>en</w:t>
+      </w:r>
+      <w:proofErr w:type="spellEnd"/>
+      <w:r>
+        <w:rPr>
+          <w:b/>
+          <w:sz w:val="28"/>
+          <w:szCs w:val="28"/>
+          <w:lang w:val="en-US"/>
+        </w:rPr>
+        <w:t xml:space="preserve"> </w:t>
+      </w:r>
+      <w:proofErr w:type="spellStart"/>
+      <w:r>
+        <w:rPr>
+          <w:b/>
+          <w:sz w:val="28"/>
+          <w:szCs w:val="28"/>
+          <w:lang w:val="en-US"/>
+        </w:rPr>
+        <w:t>créant</w:t>
+      </w:r>
+      <w:proofErr w:type="spellEnd"/>
+      <w:r>
+        <w:rPr>
+          <w:b/>
+          <w:sz w:val="28"/>
+          <w:szCs w:val="28"/>
+          <w:lang w:val="en-US"/>
+        </w:rPr>
+        <w:t xml:space="preserve"> la </w:t>
+      </w:r>
+      <w:proofErr w:type="spellStart"/>
+      <w:r>
+        <w:rPr>
+          <w:b/>
+          <w:sz w:val="28"/>
+          <w:szCs w:val="28"/>
+          <w:lang w:val="en-US"/>
+        </w:rPr>
+        <w:t>branche</w:t>
+      </w:r>
+      <w:proofErr w:type="spellEnd"/>
+      <w:r>
+        <w:rPr>
+          <w:b/>
+          <w:sz w:val="28"/>
+          <w:szCs w:val="28"/>
+          <w:lang w:val="en-US"/>
+        </w:rPr>
+        <w:t xml:space="preserve"> </w:t>
+      </w:r>
+      <w:proofErr w:type="spellStart"/>
+      <w:r>
+        <w:rPr>
+          <w:b/>
+          <w:sz w:val="28"/>
+          <w:szCs w:val="28"/>
+          <w:lang w:val="en-US"/>
+        </w:rPr>
+        <w:t>principale</w:t>
+      </w:r>
+      <w:proofErr w:type="spellEnd"/>
+      <w:r>
+        <w:rPr>
+          <w:b/>
+          <w:sz w:val="28"/>
+          <w:szCs w:val="28"/>
+          <w:lang w:val="en-US"/>
+        </w:rPr>
+        <w:t xml:space="preserve"> de </w:t>
+      </w:r>
+      <w:proofErr w:type="spellStart"/>
+      <w:r>
+        <w:rPr>
+          <w:b/>
+          <w:sz w:val="28"/>
+          <w:szCs w:val="28"/>
+          <w:lang w:val="en-US"/>
+        </w:rPr>
+        <w:t>développement</w:t>
+      </w:r>
+      <w:proofErr w:type="spellEnd"/>
+    </w:p>
+    <w:p>
+      <w:pPr>
+        <w:rPr>
+          <w:lang w:val="en-US"/>
+        </w:rPr>
+      </w:pPr>
+    </w:p>
+    <w:p>
+      <w:r>
+        <w:rPr>
+          <w:noProof/>
+          <w:lang w:eastAsia="ru-RU"/>
+        </w:rPr>
+        <w:drawing>
+          <wp:inline distT="0" distB="0" distL="0" distR="0" wp14:anchorId="31DABE60" wp14:editId="40C45A3E">
+            <wp:extent cx="5940425" cy="3042285"/>
+            <wp:effectExtent l="0" t="0" r="3175" b="5715"/>
+            <wp:docPr id="3" name="Рисунок 3"/>
+            <wp:cNvGraphicFramePr>
+              <a:graphicFrameLocks xmlns:a="http://schemas.openxmlformats.org/drawingml/2006/main" noChangeAspect="1"/>
+            </wp:cNvGraphicFramePr>
+            <a:graphic xmlns:a="http://schemas.openxmlformats.org/drawingml/2006/main">
+              <a:graphicData uri="http://schemas.openxmlformats.org/drawingml/2006/picture">
+                <pic:pic xmlns:pic="http://schemas.openxmlformats.org/drawingml/2006/picture">
+                  <pic:nvPicPr>
+                    <pic:cNvPr id="1" name=""/>
+                    <pic:cNvPicPr/>
+                  </pic:nvPicPr>
+                  <pic:blipFill>
+                    <a:blip r:embed="rId8"/>
+                    <a:stretch>
+                      <a:fillRect/>
+                    </a:stretch>
+                  </pic:blipFill>
+                  <pic:spPr>
+                    <a:xfrm>
+                      <a:off x="0" y="0"/>
                       <a:ext cx="5940425" cy="3042285"/>
                     </a:xfrm>
                     <a:prstGeom prst="rect">
@@ -127,8 +602,450 @@
           </wp:inline>
         </w:drawing>
       </w:r>
+    </w:p>
+    <w:p>
+      <w:pPr>
+        <w:pStyle w:val="a3"/>
+        <w:rPr>
+          <w:b/>
+          <w:sz w:val="28"/>
+          <w:szCs w:val="28"/>
+          <w:lang w:val="en-US"/>
+        </w:rPr>
+      </w:pPr>
+      <w:proofErr w:type="spellStart"/>
+      <w:r>
+        <w:rPr>
+          <w:b/>
+          <w:sz w:val="28"/>
+          <w:szCs w:val="28"/>
+          <w:lang w:val="en-US"/>
+        </w:rPr>
+        <w:t>J'ai</w:t>
+      </w:r>
+      <w:proofErr w:type="spellEnd"/>
+      <w:r>
+        <w:rPr>
+          <w:b/>
+          <w:sz w:val="28"/>
+          <w:szCs w:val="28"/>
+          <w:lang w:val="en-US"/>
+        </w:rPr>
+        <w:t xml:space="preserve"> </w:t>
+      </w:r>
+      <w:proofErr w:type="spellStart"/>
+      <w:r>
+        <w:rPr>
+          <w:b/>
+          <w:sz w:val="28"/>
+          <w:szCs w:val="28"/>
+          <w:lang w:val="en-US"/>
+        </w:rPr>
+        <w:t>créé</w:t>
+      </w:r>
+      <w:proofErr w:type="spellEnd"/>
+      <w:r>
+        <w:rPr>
+          <w:b/>
+          <w:sz w:val="28"/>
+          <w:szCs w:val="28"/>
+          <w:lang w:val="en-US"/>
+        </w:rPr>
+        <w:t xml:space="preserve"> et </w:t>
+      </w:r>
+      <w:proofErr w:type="spellStart"/>
+      <w:r>
+        <w:rPr>
+          <w:b/>
+          <w:sz w:val="28"/>
+          <w:szCs w:val="28"/>
+          <w:lang w:val="en-US"/>
+        </w:rPr>
+        <w:t>modifié</w:t>
+      </w:r>
+      <w:proofErr w:type="spellEnd"/>
+      <w:r>
+        <w:rPr>
+          <w:b/>
+          <w:sz w:val="28"/>
+          <w:szCs w:val="28"/>
+          <w:lang w:val="en-US"/>
+        </w:rPr>
+        <w:t xml:space="preserve"> </w:t>
+      </w:r>
+      <w:proofErr w:type="spellStart"/>
+      <w:r>
+        <w:rPr>
+          <w:b/>
+          <w:sz w:val="28"/>
+          <w:szCs w:val="28"/>
+          <w:lang w:val="en-US"/>
+        </w:rPr>
+        <w:t>une</w:t>
+      </w:r>
+      <w:proofErr w:type="spellEnd"/>
+      <w:r>
+        <w:rPr>
+          <w:b/>
+          <w:sz w:val="28"/>
+          <w:szCs w:val="28"/>
+          <w:lang w:val="en-US"/>
+        </w:rPr>
+        <w:t xml:space="preserve"> nouvelle </w:t>
+      </w:r>
+      <w:proofErr w:type="spellStart"/>
+      <w:r>
+        <w:rPr>
+          <w:b/>
+          <w:sz w:val="28"/>
+          <w:szCs w:val="28"/>
+          <w:lang w:val="en-US"/>
+        </w:rPr>
+        <w:t>branche</w:t>
+      </w:r>
+      <w:proofErr w:type="spellEnd"/>
+      <w:r>
+        <w:rPr>
+          <w:b/>
+          <w:sz w:val="28"/>
+          <w:szCs w:val="28"/>
+          <w:lang w:val="en-US"/>
+        </w:rPr>
+        <w:t xml:space="preserve"> </w:t>
+      </w:r>
+      <w:proofErr w:type="spellStart"/>
+      <w:r>
+        <w:rPr>
+          <w:b/>
+          <w:sz w:val="28"/>
+          <w:szCs w:val="28"/>
+          <w:lang w:val="en-US"/>
+        </w:rPr>
+        <w:t>localement</w:t>
+      </w:r>
+      <w:proofErr w:type="spellEnd"/>
+      <w:r>
+        <w:rPr>
+          <w:b/>
+          <w:sz w:val="28"/>
+          <w:szCs w:val="28"/>
+          <w:lang w:val="en-US"/>
+        </w:rPr>
+        <w:t xml:space="preserve">, </w:t>
+      </w:r>
+      <w:proofErr w:type="spellStart"/>
+      <w:r>
+        <w:rPr>
+          <w:b/>
+          <w:sz w:val="28"/>
+          <w:szCs w:val="28"/>
+          <w:lang w:val="en-US"/>
+        </w:rPr>
+        <w:t>puis</w:t>
+      </w:r>
+      <w:proofErr w:type="spellEnd"/>
+      <w:r>
+        <w:rPr>
+          <w:b/>
+          <w:sz w:val="28"/>
+          <w:szCs w:val="28"/>
+          <w:lang w:val="en-US"/>
+        </w:rPr>
+        <w:t xml:space="preserve"> je </w:t>
+      </w:r>
+      <w:proofErr w:type="spellStart"/>
+      <w:r>
+        <w:rPr>
+          <w:b/>
+          <w:sz w:val="28"/>
+          <w:szCs w:val="28"/>
+          <w:lang w:val="en-US"/>
+        </w:rPr>
+        <w:t>l'ai</w:t>
+      </w:r>
+      <w:proofErr w:type="spellEnd"/>
+      <w:r>
+        <w:rPr>
+          <w:b/>
+          <w:sz w:val="28"/>
+          <w:szCs w:val="28"/>
+          <w:lang w:val="en-US"/>
+        </w:rPr>
+        <w:t xml:space="preserve"> </w:t>
+      </w:r>
+      <w:proofErr w:type="spellStart"/>
+      <w:r>
+        <w:rPr>
+          <w:b/>
+          <w:sz w:val="28"/>
+          <w:szCs w:val="28"/>
+          <w:lang w:val="en-US"/>
+        </w:rPr>
+        <w:t>ajoutée</w:t>
+      </w:r>
+      <w:proofErr w:type="spellEnd"/>
+      <w:r>
+        <w:rPr>
+          <w:b/>
+          <w:sz w:val="28"/>
+          <w:szCs w:val="28"/>
+          <w:lang w:val="en-US"/>
+        </w:rPr>
+        <w:t xml:space="preserve"> au </w:t>
+      </w:r>
+      <w:proofErr w:type="spellStart"/>
+      <w:r>
+        <w:rPr>
+          <w:b/>
+          <w:sz w:val="28"/>
+          <w:szCs w:val="28"/>
+          <w:lang w:val="en-US"/>
+        </w:rPr>
+        <w:t>serveur</w:t>
+      </w:r>
+      <w:proofErr w:type="spellEnd"/>
+      <w:r>
+        <w:rPr>
+          <w:b/>
+          <w:sz w:val="28"/>
+          <w:szCs w:val="28"/>
+          <w:lang w:val="en-US"/>
+        </w:rPr>
+        <w:t xml:space="preserve"> distant </w:t>
+      </w:r>
+    </w:p>
+    <w:p>
+      <w:pPr>
+        <w:rPr>
+          <w:lang w:val="en-US"/>
+        </w:rPr>
+      </w:pPr>
+    </w:p>
+    <w:p>
+      <w:r>
+        <w:drawing>
+          <wp:inline distT="0" distB="0" distL="0" distR="0" wp14:anchorId="09A37D5C" wp14:editId="3E337469">
+            <wp:extent cx="5940425" cy="3836670"/>
+            <wp:effectExtent l="0" t="0" r="3175" b="0"/>
+            <wp:docPr id="4" name="Рисунок 4"/>
+            <wp:cNvGraphicFramePr>
+              <a:graphicFrameLocks xmlns:a="http://schemas.openxmlformats.org/drawingml/2006/main" noChangeAspect="1"/>
+            </wp:cNvGraphicFramePr>
+            <a:graphic xmlns:a="http://schemas.openxmlformats.org/drawingml/2006/main">
+              <a:graphicData uri="http://schemas.openxmlformats.org/drawingml/2006/picture">
+                <pic:pic xmlns:pic="http://schemas.openxmlformats.org/drawingml/2006/picture">
+                  <pic:nvPicPr>
+                    <pic:cNvPr id="1" name=""/>
+                    <pic:cNvPicPr/>
+                  </pic:nvPicPr>
+                  <pic:blipFill>
+                    <a:blip r:embed="rId9"/>
+                    <a:stretch>
+                      <a:fillRect/>
+                    </a:stretch>
+                  </pic:blipFill>
+                  <pic:spPr>
+                    <a:xfrm>
+                      <a:off x="0" y="0"/>
+                      <a:ext cx="5940425" cy="3836670"/>
+                    </a:xfrm>
+                    <a:prstGeom prst="rect">
+                      <a:avLst/>
+                    </a:prstGeom>
+                  </pic:spPr>
+                </pic:pic>
+              </a:graphicData>
+            </a:graphic>
+          </wp:inline>
+        </w:drawing>
+      </w:r>
+    </w:p>
+    <w:p/>
+    <w:p>
+      <w:r>
+        <w:lastRenderedPageBreak/>
+        <w:drawing>
+          <wp:inline distT="0" distB="0" distL="0" distR="0" wp14:anchorId="16B21D1F" wp14:editId="05ADD94F">
+            <wp:extent cx="5940425" cy="3100705"/>
+            <wp:effectExtent l="0" t="0" r="3175" b="4445"/>
+            <wp:docPr id="5" name="Рисунок 5"/>
+            <wp:cNvGraphicFramePr>
+              <a:graphicFrameLocks xmlns:a="http://schemas.openxmlformats.org/drawingml/2006/main" noChangeAspect="1"/>
+            </wp:cNvGraphicFramePr>
+            <a:graphic xmlns:a="http://schemas.openxmlformats.org/drawingml/2006/main">
+              <a:graphicData uri="http://schemas.openxmlformats.org/drawingml/2006/picture">
+                <pic:pic xmlns:pic="http://schemas.openxmlformats.org/drawingml/2006/picture">
+                  <pic:nvPicPr>
+                    <pic:cNvPr id="1" name=""/>
+                    <pic:cNvPicPr/>
+                  </pic:nvPicPr>
+                  <pic:blipFill>
+                    <a:blip r:embed="rId10"/>
+                    <a:stretch>
+                      <a:fillRect/>
+                    </a:stretch>
+                  </pic:blipFill>
+                  <pic:spPr>
+                    <a:xfrm>
+                      <a:off x="0" y="0"/>
+                      <a:ext cx="5940425" cy="3100705"/>
+                    </a:xfrm>
+                    <a:prstGeom prst="rect">
+                      <a:avLst/>
+                    </a:prstGeom>
+                  </pic:spPr>
+                </pic:pic>
+              </a:graphicData>
+            </a:graphic>
+          </wp:inline>
+        </w:drawing>
+      </w:r>
+    </w:p>
+    <w:p>
+      <w:pPr>
+        <w:pStyle w:val="a3"/>
+        <w:rPr>
+          <w:b/>
+          <w:lang w:val="en-US"/>
+        </w:rPr>
+      </w:pPr>
+      <w:proofErr w:type="spellStart"/>
+      <w:r>
+        <w:rPr>
+          <w:b/>
+          <w:lang w:val="en-US"/>
+        </w:rPr>
+        <w:t>J'ai</w:t>
+      </w:r>
+      <w:proofErr w:type="spellEnd"/>
+      <w:r>
+        <w:rPr>
+          <w:b/>
+          <w:lang w:val="en-US"/>
+        </w:rPr>
+        <w:t xml:space="preserve"> </w:t>
+      </w:r>
+      <w:proofErr w:type="spellStart"/>
+      <w:r>
+        <w:rPr>
+          <w:b/>
+          <w:lang w:val="en-US"/>
+        </w:rPr>
+        <w:t>ajouté</w:t>
+      </w:r>
+      <w:proofErr w:type="spellEnd"/>
+      <w:r>
+        <w:rPr>
+          <w:b/>
+          <w:lang w:val="en-US"/>
+        </w:rPr>
+        <w:t xml:space="preserve"> de </w:t>
+      </w:r>
+      <w:proofErr w:type="spellStart"/>
+      <w:r>
+        <w:rPr>
+          <w:b/>
+          <w:lang w:val="en-US"/>
+        </w:rPr>
+        <w:t>nouvelles</w:t>
+      </w:r>
+      <w:proofErr w:type="spellEnd"/>
+      <w:r>
+        <w:rPr>
+          <w:b/>
+          <w:lang w:val="en-US"/>
+        </w:rPr>
+        <w:t xml:space="preserve"> </w:t>
+      </w:r>
+      <w:proofErr w:type="spellStart"/>
+      <w:r>
+        <w:rPr>
+          <w:b/>
+          <w:lang w:val="en-US"/>
+        </w:rPr>
+        <w:t>tâches</w:t>
+      </w:r>
+      <w:proofErr w:type="spellEnd"/>
+      <w:r>
+        <w:rPr>
+          <w:b/>
+          <w:lang w:val="en-US"/>
+        </w:rPr>
+        <w:t xml:space="preserve"> au </w:t>
+      </w:r>
+      <w:proofErr w:type="spellStart"/>
+      <w:r>
+        <w:rPr>
+          <w:b/>
+          <w:lang w:val="en-US"/>
+        </w:rPr>
+        <w:t>projet</w:t>
+      </w:r>
+      <w:proofErr w:type="spellEnd"/>
+      <w:r>
+        <w:rPr>
+          <w:b/>
+          <w:lang w:val="en-US"/>
+        </w:rPr>
+        <w:t xml:space="preserve"> sur GitHub pour les participants au </w:t>
+      </w:r>
+      <w:proofErr w:type="spellStart"/>
+      <w:r>
+        <w:rPr>
+          <w:b/>
+          <w:lang w:val="en-US"/>
+        </w:rPr>
+        <w:t>projet</w:t>
+      </w:r>
       <w:bookmarkStart w:id="0" w:name="_GoBack"/>
       <w:bookmarkEnd w:id="0"/>
+      <w:proofErr w:type="spellEnd"/>
+    </w:p>
+    <w:p>
+      <w:pPr>
+        <w:rPr>
+          <w:lang w:val="en-US"/>
+        </w:rPr>
+      </w:pPr>
+    </w:p>
+    <w:p>
+      <w:r>
+        <w:drawing>
+          <wp:inline distT="0" distB="0" distL="0" distR="0" wp14:anchorId="2A9D3D61" wp14:editId="7AD73749">
+            <wp:extent cx="5940425" cy="960120"/>
+            <wp:effectExtent l="0" t="0" r="3175" b="0"/>
+            <wp:docPr id="6" name="Рисунок 6"/>
+            <wp:cNvGraphicFramePr>
+              <a:graphicFrameLocks xmlns:a="http://schemas.openxmlformats.org/drawingml/2006/main" noChangeAspect="1"/>
+            </wp:cNvGraphicFramePr>
+            <a:graphic xmlns:a="http://schemas.openxmlformats.org/drawingml/2006/main">
+              <a:graphicData uri="http://schemas.openxmlformats.org/drawingml/2006/picture">
+                <pic:pic xmlns:pic="http://schemas.openxmlformats.org/drawingml/2006/picture">
+                  <pic:nvPicPr>
+                    <pic:cNvPr id="1" name=""/>
+                    <pic:cNvPicPr/>
+                  </pic:nvPicPr>
+                  <pic:blipFill>
+                    <a:blip r:embed="rId11"/>
+                    <a:stretch>
+                      <a:fillRect/>
+                    </a:stretch>
+                  </pic:blipFill>
+                  <pic:spPr>
+                    <a:xfrm>
+                      <a:off x="0" y="0"/>
+                      <a:ext cx="5940425" cy="960120"/>
+                    </a:xfrm>
+                    <a:prstGeom prst="rect">
+                      <a:avLst/>
+                    </a:prstGeom>
+                  </pic:spPr>
+                </pic:pic>
+              </a:graphicData>
+            </a:graphic>
+          </wp:inline>
+        </w:drawing>
+      </w:r>
     </w:p>
     <w:sectPr>
       <w:pgSz w:w="11906" w:h="16838"/>
@@ -138,6 +1055,56 @@
     </w:sectPr>
   </w:body>
 </w:document>
+</file>
+
+<file path=word/endnotes.xml><?xml version="1.0" encoding="utf-8"?>
+<w:endnotes xmlns:wpc="http://schemas.microsoft.com/office/word/2010/wordprocessingCanvas" xmlns:cx="http://schemas.microsoft.com/office/drawing/2014/chartex" xmlns:mc="http://schemas.openxmlformats.org/markup-compatibility/2006" xmlns:o="urn:schemas-microsoft-com:office:office" xmlns:r="http://schemas.openxmlformats.org/officeDocument/2006/relationships" xmlns:m="http://schemas.openxmlformats.org/officeDocument/2006/math" xmlns:v="urn:schemas-microsoft-com:vml" xmlns:wp14="http://schemas.microsoft.com/office/word/2010/wordprocessingDrawing" xmlns:wp="http://schemas.openxmlformats.org/drawingml/2006/wordprocessingDrawing" xmlns:w10="urn:schemas-microsoft-com:office:word" xmlns:w="http://schemas.openxmlformats.org/wordprocessingml/2006/main" xmlns:w14="http://schemas.microsoft.com/office/word/2010/wordml" xmlns:w15="http://schemas.microsoft.com/office/word/2012/wordml" xmlns:w16se="http://schemas.microsoft.com/office/word/2015/wordml/symex" xmlns:wpg="http://schemas.microsoft.com/office/word/2010/wordprocessingGroup" xmlns:wpi="http://schemas.microsoft.com/office/word/2010/wordprocessingInk" xmlns:wne="http://schemas.microsoft.com/office/word/2006/wordml" xmlns:wps="http://schemas.microsoft.com/office/word/2010/wordprocessingShape" mc:Ignorable="w14 w15 w16se wp14">
+  <w:endnote w:type="separator" w:id="-1">
+    <w:p>
+      <w:pPr>
+        <w:spacing w:after="0" w:line="240" w:lineRule="auto"/>
+      </w:pPr>
+      <w:r>
+        <w:separator/>
+      </w:r>
+    </w:p>
+  </w:endnote>
+  <w:endnote w:type="continuationSeparator" w:id="0">
+    <w:p>
+      <w:pPr>
+        <w:spacing w:after="0" w:line="240" w:lineRule="auto"/>
+      </w:pPr>
+      <w:r>
+        <w:continuationSeparator/>
+      </w:r>
+    </w:p>
+  </w:endnote>
+</w:endnotes>
+</file>
+
+<file path=word/footnotes.xml><?xml version="1.0" encoding="utf-8"?>
+<w:footnotes xmlns:wpc="http://schemas.microsoft.com/office/word/2010/wordprocessingCanvas" xmlns:cx="http://schemas.microsoft.com/office/drawing/2014/chartex" xmlns:mc="http://schemas.openxmlformats.org/markup-compatibility/2006" xmlns:o="urn:schemas-microsoft-com:office:office" xmlns:r="http://schemas.openxmlformats.org/officeDocument/2006/relationships" xmlns:m="http://schemas.openxmlformats.org/officeDocument/2006/math" xmlns:v="urn:schemas-microsoft-com:vml" xmlns:wp14="http://schemas.microsoft.com/office/word/2010/wordprocessingDrawing" xmlns:wp="http://schemas.openxmlformats.org/drawingml/2006/wordprocessingDrawing" xmlns:w10="urn:schemas-microsoft-com:office:word" xmlns:w="http://schemas.openxmlformats.org/wordprocessingml/2006/main" xmlns:w14="http://schemas.microsoft.com/office/word/2010/wordml" xmlns:w15="http://schemas.microsoft.com/office/word/2012/wordml" xmlns:w16se="http://schemas.microsoft.com/office/word/2015/wordml/symex" xmlns:wpg="http://schemas.microsoft.com/office/word/2010/wordprocessingGroup" xmlns:wpi="http://schemas.microsoft.com/office/word/2010/wordprocessingInk" xmlns:wne="http://schemas.microsoft.com/office/word/2006/wordml" xmlns:wps="http://schemas.microsoft.com/office/word/2010/wordprocessingShape" mc:Ignorable="w14 w15 w16se wp14">
+  <w:footnote w:type="separator" w:id="-1">
+    <w:p>
+      <w:pPr>
+        <w:spacing w:after="0" w:line="240" w:lineRule="auto"/>
+      </w:pPr>
+      <w:r>
+        <w:separator/>
+      </w:r>
+    </w:p>
+  </w:footnote>
+  <w:footnote w:type="continuationSeparator" w:id="0">
+    <w:p>
+      <w:pPr>
+        <w:spacing w:after="0" w:line="240" w:lineRule="auto"/>
+      </w:pPr>
+      <w:r>
+        <w:continuationSeparator/>
+      </w:r>
+    </w:p>
+  </w:footnote>
+</w:footnotes>
 </file>
 
 <file path=word/styles.xml><?xml version="1.0" encoding="utf-8"?>
@@ -561,6 +1528,67 @@
     <w:semiHidden/>
     <w:unhideWhenUsed/>
   </w:style>
+  <w:style w:type="paragraph" w:styleId="a3">
+    <w:name w:val="Normal (Web)"/>
+    <w:basedOn w:val="a"/>
+    <w:uiPriority w:val="99"/>
+    <w:semiHidden/>
+    <w:unhideWhenUsed/>
+    <w:rsid w:val="002F6DAC"/>
+    <w:pPr>
+      <w:spacing w:before="100" w:beforeAutospacing="1" w:after="100" w:afterAutospacing="1" w:line="240" w:lineRule="auto"/>
+    </w:pPr>
+    <w:rPr>
+      <w:rFonts w:ascii="Times New Roman" w:eastAsia="Times New Roman" w:hAnsi="Times New Roman" w:cs="Times New Roman"/>
+      <w:sz w:val="24"/>
+      <w:szCs w:val="24"/>
+      <w:lang w:eastAsia="ru-RU"/>
+    </w:rPr>
+  </w:style>
+  <w:style w:type="paragraph" w:styleId="a4">
+    <w:name w:val="header"/>
+    <w:basedOn w:val="a"/>
+    <w:link w:val="a5"/>
+    <w:uiPriority w:val="99"/>
+    <w:unhideWhenUsed/>
+    <w:rsid w:val="002F6DAC"/>
+    <w:pPr>
+      <w:tabs>
+        <w:tab w:val="center" w:pos="4677"/>
+        <w:tab w:val="right" w:pos="9355"/>
+      </w:tabs>
+      <w:spacing w:after="0" w:line="240" w:lineRule="auto"/>
+    </w:pPr>
+  </w:style>
+  <w:style w:type="character" w:customStyle="1" w:styleId="a5">
+    <w:name w:val="Верхний колонтитул Знак"/>
+    <w:basedOn w:val="a0"/>
+    <w:link w:val="a4"/>
+    <w:uiPriority w:val="99"/>
+    <w:rsid w:val="002F6DAC"/>
+  </w:style>
+  <w:style w:type="paragraph" w:styleId="a6">
+    <w:name w:val="footer"/>
+    <w:basedOn w:val="a"/>
+    <w:link w:val="a7"/>
+    <w:uiPriority w:val="99"/>
+    <w:unhideWhenUsed/>
+    <w:rsid w:val="002F6DAC"/>
+    <w:pPr>
+      <w:tabs>
+        <w:tab w:val="center" w:pos="4677"/>
+        <w:tab w:val="right" w:pos="9355"/>
+      </w:tabs>
+      <w:spacing w:after="0" w:line="240" w:lineRule="auto"/>
+    </w:pPr>
+  </w:style>
+  <w:style w:type="character" w:customStyle="1" w:styleId="a7">
+    <w:name w:val="Нижний колонтитул Знак"/>
+    <w:basedOn w:val="a0"/>
+    <w:link w:val="a6"/>
+    <w:uiPriority w:val="99"/>
+    <w:rsid w:val="002F6DAC"/>
+  </w:style>
 </w:styles>
 </file>
 

</xml_diff>